<commit_message>
separação dos Logs por sessao do usuario.
</commit_message>
<xml_diff>
--- a/Docs/EnvConfigs.docx
+++ b/Docs/EnvConfigs.docx
@@ -47,7 +47,70 @@
           <w:rFonts w:ascii="Arial" w:hAnsi="Arial" w:cs="Arial"/>
         </w:rPr>
         <w:br/>
-        <w:t>Adicionar os elementos</w:t>
+        <w:t xml:space="preserve">Adicionar </w:t>
+      </w:r>
+      <w:r>
+        <w:rPr>
+          <w:rFonts w:ascii="Arial" w:hAnsi="Arial" w:cs="Arial"/>
+        </w:rPr>
+        <w:t>as v</w:t>
+      </w:r>
+      <w:r>
+        <w:rPr>
+          <w:rFonts w:ascii="Arial" w:hAnsi="Arial" w:cs="Arial"/>
+        </w:rPr>
+        <w:t xml:space="preserve">ariáveis de ambiente no </w:t>
+      </w:r>
+      <w:r>
+        <w:rPr>
+          <w:rFonts w:ascii="Arial" w:hAnsi="Arial" w:cs="Arial"/>
+        </w:rPr>
+        <w:t>.</w:t>
+      </w:r>
+      <w:proofErr w:type="spellStart"/>
+      <w:r>
+        <w:rPr>
+          <w:rFonts w:ascii="Arial" w:hAnsi="Arial" w:cs="Arial"/>
+        </w:rPr>
+        <w:t>env</w:t>
+      </w:r>
+      <w:proofErr w:type="spellEnd"/>
+    </w:p>
+    <w:p>
+      <w:pPr>
+        <w:rPr>
+          <w:rFonts w:ascii="Arial" w:hAnsi="Arial" w:cs="Arial"/>
+        </w:rPr>
+      </w:pPr>
+    </w:p>
+    <w:p>
+      <w:pPr>
+        <w:rPr>
+          <w:rFonts w:ascii="Arial" w:hAnsi="Arial" w:cs="Arial"/>
+        </w:rPr>
+      </w:pPr>
+      <w:hyperlink r:id="rId4" w:history="1">
+        <w:r>
+          <w:rPr>
+            <w:rStyle w:val="Hyperlink"/>
+            <w:rFonts w:ascii="Arial" w:hAnsi="Arial" w:cs="Arial"/>
+          </w:rPr>
+          <w:t>BREVO_USERNAME=ab85f0001@smtp-brevo.com</w:t>
+        </w:r>
+      </w:hyperlink>
+    </w:p>
+    <w:p>
+      <w:pPr>
+        <w:rPr>
+          <w:rFonts w:ascii="Arial" w:hAnsi="Arial" w:cs="Arial"/>
+        </w:rPr>
+      </w:pPr>
+      <w:r>
+        <w:rPr>
+          <w:rFonts w:ascii="Arial" w:hAnsi="Arial" w:cs="Arial"/>
+        </w:rPr>
+        <w:br/>
+        <w:t>BREVO_PASSWORD=xsmtpsib-bf38c102bd0b6b1a927729bf6517ec50158b74382e6b2f348e83b42709e2257e-2bFV1vqeMILDG1hw</w:t>
       </w:r>
     </w:p>
     <w:p>
@@ -60,247 +123,22 @@
         <w:rPr>
           <w:rFonts w:ascii="Arial" w:hAnsi="Arial" w:cs="Arial"/>
         </w:rPr>
-        <w:t>Variáveis de ambiente no CMD:</w:t>
+        <w:br/>
+        <w:t>KEYSTORE_PASSWORD=tcc123</w:t>
       </w:r>
     </w:p>
     <w:p>
       <w:pPr>
         <w:rPr>
           <w:rFonts w:ascii="Arial" w:hAnsi="Arial" w:cs="Arial"/>
-          <w:lang w:val="en-US"/>
-        </w:rPr>
-      </w:pPr>
-      <w:proofErr w:type="spellStart"/>
-      <w:r>
-        <w:rPr>
-          <w:rFonts w:ascii="Arial" w:hAnsi="Arial" w:cs="Arial"/>
-          <w:lang w:val="en-US"/>
-        </w:rPr>
-        <w:t>setx</w:t>
-      </w:r>
-      <w:proofErr w:type="spellEnd"/>
-      <w:r>
-        <w:rPr>
-          <w:rFonts w:ascii="Arial" w:hAnsi="Arial" w:cs="Arial"/>
-          <w:lang w:val="en-US"/>
-        </w:rPr>
-        <w:t xml:space="preserve"> MAIL_USERNAME "tccumcriqedmat@gmail.com"</w:t>
-      </w:r>
-    </w:p>
-    <w:p>
-      <w:pPr>
-        <w:rPr>
-          <w:rFonts w:ascii="Arial" w:hAnsi="Arial" w:cs="Arial"/>
-          <w:lang w:val="en-US"/>
-        </w:rPr>
-      </w:pPr>
-      <w:proofErr w:type="spellStart"/>
-      <w:r>
-        <w:rPr>
-          <w:rFonts w:ascii="Arial" w:hAnsi="Arial" w:cs="Arial"/>
-          <w:lang w:val="en-US"/>
-        </w:rPr>
-        <w:t>setx</w:t>
-      </w:r>
-      <w:proofErr w:type="spellEnd"/>
-      <w:r>
-        <w:rPr>
-          <w:rFonts w:ascii="Arial" w:hAnsi="Arial" w:cs="Arial"/>
-          <w:lang w:val="en-US"/>
-        </w:rPr>
-        <w:t xml:space="preserve"> MAIL_PASSWORD "</w:t>
-      </w:r>
-      <w:proofErr w:type="spellStart"/>
-      <w:r>
-        <w:rPr>
-          <w:rFonts w:ascii="Arial" w:hAnsi="Arial" w:cs="Arial"/>
-          <w:lang w:val="en-US"/>
-        </w:rPr>
-        <w:t>bhgd</w:t>
-      </w:r>
-      <w:proofErr w:type="spellEnd"/>
-      <w:r>
-        <w:rPr>
-          <w:rFonts w:ascii="Arial" w:hAnsi="Arial" w:cs="Arial"/>
-          <w:lang w:val="en-US"/>
-        </w:rPr>
-        <w:t xml:space="preserve"> </w:t>
-      </w:r>
-      <w:proofErr w:type="spellStart"/>
-      <w:r>
-        <w:rPr>
-          <w:rFonts w:ascii="Arial" w:hAnsi="Arial" w:cs="Arial"/>
-          <w:lang w:val="en-US"/>
-        </w:rPr>
-        <w:t>vxqe</w:t>
-      </w:r>
-      <w:proofErr w:type="spellEnd"/>
-      <w:r>
-        <w:rPr>
-          <w:rFonts w:ascii="Arial" w:hAnsi="Arial" w:cs="Arial"/>
-          <w:lang w:val="en-US"/>
-        </w:rPr>
-        <w:t xml:space="preserve"> </w:t>
-      </w:r>
-      <w:proofErr w:type="spellStart"/>
-      <w:r>
-        <w:rPr>
-          <w:rFonts w:ascii="Arial" w:hAnsi="Arial" w:cs="Arial"/>
-          <w:lang w:val="en-US"/>
-        </w:rPr>
-        <w:t>rpiy</w:t>
-      </w:r>
-      <w:proofErr w:type="spellEnd"/>
-      <w:r>
-        <w:rPr>
-          <w:rFonts w:ascii="Arial" w:hAnsi="Arial" w:cs="Arial"/>
-          <w:lang w:val="en-US"/>
-        </w:rPr>
-        <w:t xml:space="preserve"> </w:t>
-      </w:r>
-      <w:proofErr w:type="spellStart"/>
-      <w:r>
-        <w:rPr>
-          <w:rFonts w:ascii="Arial" w:hAnsi="Arial" w:cs="Arial"/>
-          <w:lang w:val="en-US"/>
-        </w:rPr>
-        <w:t>vzyx</w:t>
-      </w:r>
-      <w:proofErr w:type="spellEnd"/>
-      <w:r>
-        <w:rPr>
-          <w:rFonts w:ascii="Arial" w:hAnsi="Arial" w:cs="Arial"/>
-          <w:lang w:val="en-US"/>
-        </w:rPr>
-        <w:t>"</w:t>
-      </w:r>
-    </w:p>
-    <w:p>
-      <w:pPr>
-        <w:rPr>
-          <w:rFonts w:ascii="Arial" w:hAnsi="Arial" w:cs="Arial"/>
-          <w:lang w:val="en-US"/>
-        </w:rPr>
-      </w:pPr>
-    </w:p>
-    <w:p>
-      <w:pPr>
-        <w:rPr>
-          <w:rFonts w:ascii="Arial" w:hAnsi="Arial" w:cs="Arial"/>
         </w:rPr>
       </w:pPr>
       <w:r>
         <w:rPr>
           <w:rFonts w:ascii="Arial" w:hAnsi="Arial" w:cs="Arial"/>
-          <w:sz w:val="32"/>
-          <w:szCs w:val="32"/>
-        </w:rPr>
-        <w:t>Configurações para HTTPS</w:t>
-      </w:r>
-      <w:r>
-        <w:rPr>
-          <w:rFonts w:ascii="Arial" w:hAnsi="Arial" w:cs="Arial"/>
         </w:rPr>
         <w:br/>
-      </w:r>
-      <w:proofErr w:type="spellStart"/>
-      <w:r>
-        <w:rPr>
-          <w:rFonts w:ascii="Arial" w:hAnsi="Arial" w:cs="Arial"/>
-        </w:rPr>
-        <w:t>setx</w:t>
-      </w:r>
-      <w:proofErr w:type="spellEnd"/>
-      <w:r>
-        <w:rPr>
-          <w:rFonts w:ascii="Arial" w:hAnsi="Arial" w:cs="Arial"/>
-        </w:rPr>
-        <w:t xml:space="preserve"> KEYSTORE_PASSWORD tcc123</w:t>
-      </w:r>
-    </w:p>
-    <w:p>
-      <w:pPr>
-        <w:rPr>
-          <w:rFonts w:ascii="Arial" w:hAnsi="Arial" w:cs="Arial"/>
-        </w:rPr>
-      </w:pPr>
-    </w:p>
-    <w:p>
-      <w:pPr>
-        <w:rPr>
-          <w:rFonts w:ascii="Arial" w:hAnsi="Arial" w:cs="Arial"/>
-          <w:sz w:val="32"/>
-          <w:szCs w:val="32"/>
-        </w:rPr>
-      </w:pPr>
-      <w:r>
-        <w:rPr>
-          <w:rFonts w:ascii="Arial" w:hAnsi="Arial" w:cs="Arial"/>
-          <w:sz w:val="32"/>
-          <w:szCs w:val="32"/>
-        </w:rPr>
-        <w:t>UsuarioDAO.java</w:t>
-      </w:r>
-    </w:p>
-    <w:p>
-      <w:pPr>
-        <w:rPr>
-          <w:rFonts w:ascii="Arial" w:hAnsi="Arial" w:cs="Arial"/>
-        </w:rPr>
-      </w:pPr>
-      <w:proofErr w:type="spellStart"/>
-      <w:r>
-        <w:rPr>
-          <w:rFonts w:ascii="Arial" w:hAnsi="Arial" w:cs="Arial"/>
-        </w:rPr>
-        <w:t>setx</w:t>
-      </w:r>
-      <w:proofErr w:type="spellEnd"/>
-      <w:r>
-        <w:rPr>
-          <w:rFonts w:ascii="Arial" w:hAnsi="Arial" w:cs="Arial"/>
-        </w:rPr>
-        <w:t xml:space="preserve"> DB_US</w:t>
-      </w:r>
-      <w:r>
-        <w:rPr>
-          <w:rFonts w:ascii="Arial" w:hAnsi="Arial" w:cs="Arial"/>
-        </w:rPr>
-        <w:t>UARIO</w:t>
-      </w:r>
-      <w:r>
-        <w:rPr>
-          <w:rFonts w:ascii="Arial" w:hAnsi="Arial" w:cs="Arial"/>
-        </w:rPr>
-        <w:t xml:space="preserve"> root</w:t>
-      </w:r>
-    </w:p>
-    <w:p>
-      <w:proofErr w:type="spellStart"/>
-      <w:r>
-        <w:rPr>
-          <w:rFonts w:ascii="Arial" w:hAnsi="Arial" w:cs="Arial"/>
-        </w:rPr>
-        <w:t>setx</w:t>
-      </w:r>
-      <w:proofErr w:type="spellEnd"/>
-      <w:r>
-        <w:rPr>
-          <w:rFonts w:ascii="Arial" w:hAnsi="Arial" w:cs="Arial"/>
-        </w:rPr>
-        <w:t xml:space="preserve"> DB_</w:t>
-      </w:r>
-      <w:r>
-        <w:rPr>
-          <w:rFonts w:ascii="Arial" w:hAnsi="Arial" w:cs="Arial"/>
-        </w:rPr>
-        <w:t>SENHA</w:t>
-      </w:r>
-      <w:r>
-        <w:rPr>
-          <w:rFonts w:ascii="Arial" w:hAnsi="Arial" w:cs="Arial"/>
-        </w:rPr>
-        <w:t xml:space="preserve"> 72B4688B321DBD81718EC88A9BDCBCFD</w:t>
+        <w:t>DB_URL=jdbc:postgresql://aws-1-us-west-1.pooler.supabase.com:5432/postgres?user=postgres.camlusvpstxhsxkmlwfx&amp;password=72B4688B321DBD81718EC88A9BDCBCFD&amp;sslmode=require</w:t>
       </w:r>
     </w:p>
     <w:p/>

</xml_diff>